<commit_message>
Add ZP-2026-R005: AI Agent Monetization Models (许墨白/调研部)
</commit_message>
<xml_diff>
--- a/templates/reference.docx
+++ b/templates/reference.docx
@@ -317,7 +317,7 @@
       <w:footnotePr>
         <w:numRestart w:val="eachSect"/>
       </w:footnotePr>
-      <w:pgMar w:top="1440" w:bottom="1440" w:left="1797" w:right="1797"/>
+      <w:pgMar w:top="2098" w:bottom="1984" w:left="1587" w:right="1474"/>
     </w:sectPr>
   </w:body>
 </w:document>
@@ -502,10 +502,13 @@
   <w:style w:type="paragraph" w:default="1" w:styleId="Normal">
     <w:name w:val="Normal"/>
     <w:qFormat/>
-    <w:rPr>
-      <w:rFonts w:ascii="等线" w:hAnsi="等线" w:eastAsia="等线"/>
-      <w:color w:val="222222"/>
-      <w:sz w:val="21"/>
+    <w:pPr>
+      <w:spacing w:line="560" w:lineRule="exact" w:before="0" w:after="0"/>
+    </w:pPr>
+    <w:rPr>
+      <w:rFonts w:ascii="仿宋" w:hAnsi="仿宋" w:eastAsia="仿宋"/>
+      <w:color w:val="000000"/>
+      <w:sz w:val="32"/>
     </w:rPr>
   </w:style>
   <w:style w:type="paragraph" w:styleId="BodyText">
@@ -675,12 +678,12 @@
     <w:pPr>
       <w:keepNext/>
       <w:keepLines/>
-      <w:spacing w:before="480" w:after="80"/>
+      <w:spacing w:before="0" w:after="0" w:line="560" w:lineRule="exact"/>
       <w:jc w:val="center"/>
       <w:outlineLvl w:val="0"/>
     </w:pPr>
     <w:rPr>
-      <w:rFonts w:asciiTheme="majorHAnsi" w:eastAsiaTheme="majorEastAsia" w:hAnsiTheme="majorHAnsi" w:cstheme="majorBidi" w:ascii="黑体" w:hAnsi="黑体" w:eastAsia="黑体"/>
+      <w:rFonts w:asciiTheme="majorHAnsi" w:eastAsiaTheme="majorEastAsia" w:hAnsiTheme="majorHAnsi" w:cstheme="majorBidi" w:ascii="宋体" w:hAnsi="宋体" w:eastAsia="宋体"/>
       <w:b/>
       <w:color w:val="000000"/>
       <w:sz w:val="44"/>
@@ -700,38 +703,38 @@
     <w:pPr>
       <w:keepNext/>
       <w:keepLines/>
-      <w:spacing w:before="160" w:after="80"/>
+      <w:spacing w:before="0" w:after="0" w:line="560" w:lineRule="exact"/>
       <w:outlineLvl w:val="1"/>
     </w:pPr>
     <w:rPr>
       <w:rFonts w:asciiTheme="majorHAnsi" w:eastAsiaTheme="majorEastAsia" w:hAnsiTheme="majorHAnsi" w:cstheme="majorBidi" w:ascii="黑体" w:hAnsi="黑体" w:eastAsia="黑体"/>
+      <w:b w:val="0"/>
+      <w:color w:val="000000"/>
+      <w:sz w:val="32"/>
+      <w:szCs w:val="32"/>
+    </w:rPr>
+  </w:style>
+  <w:style w:type="paragraph" w:styleId="Heading3">
+    <w:name w:val="heading 3"/>
+    <w:basedOn w:val="Normal"/>
+    <w:next w:val="BodyText"/>
+    <w:link w:val="Heading3Char"/>
+    <w:uiPriority w:val="9"/>
+    <w:semiHidden/>
+    <w:unhideWhenUsed/>
+    <w:qFormat/>
+    <w:rsid w:val="00A10FD9"/>
+    <w:pPr>
+      <w:keepNext/>
+      <w:keepLines/>
+      <w:spacing w:before="0" w:after="0" w:line="560" w:lineRule="exact"/>
+      <w:outlineLvl w:val="2"/>
+    </w:pPr>
+    <w:rPr>
+      <w:rFonts w:eastAsiaTheme="majorEastAsia" w:cstheme="majorBidi" w:ascii="楷体" w:hAnsi="楷体" w:eastAsia="楷体"/>
       <w:b/>
       <w:color w:val="000000"/>
-      <w:sz w:val="30"/>
-      <w:szCs w:val="32"/>
-    </w:rPr>
-  </w:style>
-  <w:style w:type="paragraph" w:styleId="Heading3">
-    <w:name w:val="heading 3"/>
-    <w:basedOn w:val="Normal"/>
-    <w:next w:val="BodyText"/>
-    <w:link w:val="Heading3Char"/>
-    <w:uiPriority w:val="9"/>
-    <w:semiHidden/>
-    <w:unhideWhenUsed/>
-    <w:qFormat/>
-    <w:rsid w:val="00A10FD9"/>
-    <w:pPr>
-      <w:keepNext/>
-      <w:keepLines/>
-      <w:spacing w:before="160" w:after="80"/>
-      <w:outlineLvl w:val="2"/>
-    </w:pPr>
-    <w:rPr>
-      <w:rFonts w:eastAsiaTheme="majorEastAsia" w:cstheme="majorBidi" w:ascii="黑体" w:hAnsi="黑体" w:eastAsia="黑体"/>
-      <w:b/>
-      <w:color w:val="000000"/>
-      <w:sz w:val="24"/>
+      <w:sz w:val="32"/>
       <w:szCs w:val="28"/>
     </w:rPr>
   </w:style>
@@ -748,16 +751,16 @@
     <w:pPr>
       <w:keepNext/>
       <w:keepLines/>
-      <w:spacing w:before="80" w:after="40"/>
+      <w:spacing w:before="0" w:after="0" w:line="560" w:lineRule="exact"/>
       <w:outlineLvl w:val="3"/>
     </w:pPr>
     <w:rPr>
-      <w:rFonts w:eastAsiaTheme="majorEastAsia" w:cstheme="majorBidi" w:ascii="黑体" w:hAnsi="黑体" w:eastAsia="黑体"/>
+      <w:rFonts w:eastAsiaTheme="majorEastAsia" w:cstheme="majorBidi" w:ascii="仿宋" w:hAnsi="仿宋" w:eastAsia="仿宋"/>
       <w:b/>
       <w:i/>
       <w:iCs/>
       <w:color w:val="000000"/>
-      <w:sz w:val="22"/>
+      <w:sz w:val="32"/>
     </w:rPr>
   </w:style>
   <w:style w:type="paragraph" w:styleId="Heading5">
@@ -1031,6 +1034,14 @@
     <w:semiHidden/>
     <w:unhideWhenUsed/>
     <w:qFormat/>
+    <w:pPr>
+      <w:spacing w:line="320" w:lineRule="exact" w:before="0" w:after="0"/>
+    </w:pPr>
+    <w:rPr>
+      <w:rFonts w:ascii="仿宋" w:hAnsi="仿宋" w:eastAsia="仿宋"/>
+      <w:color w:val="000000"/>
+      <w:sz w:val="21"/>
+    </w:rPr>
     <w:tblPr>
       <w:tblInd w:w="0" w:type="dxa"/>
       <w:tblCellMar>

</xml_diff>

<commit_message>
sync: publish pipeline updates + AI agent monetization post
</commit_message>
<xml_diff>
--- a/templates/reference.docx
+++ b/templates/reference.docx
@@ -317,6 +317,7 @@
       <w:footnotePr>
         <w:numRestart w:val="eachSect"/>
       </w:footnotePr>
+      <w:pgSz w:w="11906" w:h="16838"/>
       <w:pgMar w:top="2098" w:bottom="1984" w:left="1587" w:right="1474"/>
     </w:sectPr>
   </w:body>
@@ -517,8 +518,13 @@
     <w:link w:val="BodyTextChar"/>
     <w:qFormat/>
     <w:pPr>
-      <w:spacing w:before="180" w:after="180"/>
-    </w:pPr>
+      <w:spacing w:before="180" w:after="180" w:line="560" w:lineRule="exact"/>
+    </w:pPr>
+    <w:rPr>
+      <w:rFonts w:ascii="仿宋" w:hAnsi="仿宋" w:eastAsia="仿宋"/>
+      <w:color w:val="000000"/>
+      <w:sz w:val="32"/>
+    </w:rPr>
   </w:style>
   <w:style w:type="paragraph" w:customStyle="1" w:styleId="FirstParagraph">
     <w:name w:val="First Paragraph"/>
@@ -1153,10 +1159,11 @@
       <w:outlineLvl w:val="9"/>
     </w:pPr>
     <w:rPr>
-      <w:rFonts w:asciiTheme="majorHAnsi" w:eastAsiaTheme="majorEastAsia" w:hAnsiTheme="majorHAnsi" w:cstheme="majorBidi"/>
+      <w:rFonts w:asciiTheme="majorHAnsi" w:eastAsiaTheme="majorEastAsia" w:hAnsiTheme="majorHAnsi" w:cstheme="majorBidi" w:ascii="仿宋" w:hAnsi="仿宋" w:eastAsia="仿宋"/>
       <w:b w:val="0"/>
       <w:bCs w:val="0"/>
       <w:color w:val="365F91" w:themeColor="accent1" w:themeShade="BF"/>
+      <w:sz w:val="24"/>
     </w:rPr>
   </w:style>
 </w:styles>

</xml_diff>